<commit_message>
v2: social, presentation, documents, cards and signatures rebuilt on the new system with real contacts
Co-Authored-By: Claude Opus 5.5 <noreply@anthropic.com>
Claude-Session: https://claude.ai/code/session_01DLSMnj5wd3Rg3Zvu6XTEmR
</commit_message>
<xml_diff>
--- a/DESTINATION-NIGERIA-BRAND-KIT/09_DOCUMENT_TEMPLATES/INVESTMENT_PROFILE/DN_Investment-Opportunity-Profile_A4.docx
+++ b/DESTINATION-NIGERIA-BRAND-KIT/09_DOCUMENT_TEMPLATES/INVESTMENT_PROFILE/DN_Investment-Opportunity-Profile_A4.docx
@@ -5,7 +5,7 @@
     <w:p>
       <w:r>
         <w:drawing>
-          <wp:anchor distT="0" distB="0" distL="0" distR="0" simplePos="0" relativeHeight="251663256" behindDoc="1" locked="1" layoutInCell="1" allowOverlap="1">
+          <wp:anchor distT="0" distB="0" distL="0" distR="0" simplePos="0" relativeHeight="251663252" behindDoc="1" locked="1" layoutInCell="1" allowOverlap="1">
             <wp:simplePos x="0" y="0"/>
             <wp:positionH relativeFrom="page">
               <wp:posOffset>0</wp:posOffset>
@@ -16,7 +16,7 @@
             <wp:extent cx="7560000" cy="3312000"/>
             <wp:effectExtent l="0" t="0" r="0" b="0"/>
             <wp:wrapNone/>
-            <wp:docPr id="5017" name="Picture 1"/>
+            <wp:docPr id="5013" name="Picture 1"/>
             <wp:cNvGraphicFramePr xmlns:a="http://schemas.openxmlformats.org/drawingml/2006/main">
               <a:graphicFrameLocks noChangeAspect="1"/>
             </wp:cNvGraphicFramePr>
@@ -24,7 +24,7 @@
               <a:graphicData uri="http://schemas.openxmlformats.org/drawingml/2006/picture">
                 <pic:pic>
                   <pic:nvPicPr>
-                    <pic:cNvPr id="0" name="photo.jpg"/>
+                    <pic:cNvPr id="0" name="photo_invest.jpg"/>
                     <pic:cNvPicPr/>
                   </pic:nvPicPr>
                   <pic:blipFill>
@@ -114,18 +114,18 @@
         <w:tblW w:type="auto" w:w="0"/>
         <w:tblLook w:firstColumn="1" w:firstRow="1" w:lastColumn="0" w:lastRow="0" w:noHBand="0" w:noVBand="1" w:val="04A0"/>
         <w:tblBorders>
-          <w:top w:val="nil"/>
-          <w:left w:val="nil"/>
-          <w:bottom w:val="nil"/>
-          <w:right w:val="nil"/>
-          <w:insideH w:val="single" w:sz="2" w:color="F5F0E6"/>
+          <w:top w:val="single" w:sz="6" w:color="103428"/>
+          <w:left w:val="nil"/>
+          <w:bottom w:val="single" w:sz="6" w:color="103428"/>
+          <w:right w:val="nil"/>
+          <w:insideH w:val="single" w:sz="6" w:color="103428"/>
           <w:insideV w:val="nil"/>
         </w:tblBorders>
         <w:tblCellMar>
-          <w:top w:w="160" w:type="dxa"/>
-          <w:left w:w="220" w:type="dxa"/>
-          <w:bottom w:w="160" w:type="dxa"/>
-          <w:right w:w="220" w:type="dxa"/>
+          <w:top w:w="120" w:type="dxa"/>
+          <w:left w:w="0" w:type="dxa"/>
+          <w:bottom w:w="140" w:type="dxa"/>
+          <w:right w:w="0" w:type="dxa"/>
         </w:tblCellMar>
       </w:tblPr>
       <w:tblGrid>
@@ -135,10 +135,6 @@
         <w:tc>
           <w:tcPr>
             <w:tcW w:type="dxa" w:w="9412"/>
-            <w:shd w:val="clear" w:color="auto" w:fill="F5F0E6"/>
-            <w:tcBorders>
-              <w:left w:val="single" w:sz="24" w:color="B4532A"/>
-            </w:tcBorders>
           </w:tcPr>
           <w:p>
             <w:pPr>
@@ -193,16 +189,16 @@
         <w:tblW w:type="auto" w:w="0"/>
         <w:tblLook w:firstColumn="1" w:firstRow="1" w:lastColumn="0" w:lastRow="0" w:noHBand="0" w:noVBand="1" w:val="04A0"/>
         <w:tblBorders>
-          <w:top w:val="single" w:sz="4" w:color="A9BFA9"/>
-          <w:left w:val="nil"/>
-          <w:bottom w:val="single" w:sz="4" w:color="A9BFA9"/>
-          <w:right w:val="nil"/>
-          <w:insideH w:val="single" w:sz="4" w:color="A9BFA9"/>
+          <w:top w:val="single" w:sz="4" w:color="E7DFCF"/>
+          <w:left w:val="nil"/>
+          <w:bottom w:val="single" w:sz="4" w:color="E7DFCF"/>
+          <w:right w:val="nil"/>
+          <w:insideH w:val="single" w:sz="4" w:color="E7DFCF"/>
           <w:insideV w:val="nil"/>
         </w:tblBorders>
         <w:tblCellMar>
           <w:top w:w="70" w:type="dxa"/>
-          <w:left w:w="100" w:type="dxa"/>
+          <w:left w:w="0" w:type="dxa"/>
           <w:bottom w:w="70" w:type="dxa"/>
           <w:right w:w="100" w:type="dxa"/>
         </w:tblCellMar>
@@ -215,7 +211,6 @@
         <w:tc>
           <w:tcPr>
             <w:tcW w:type="dxa" w:w="2948"/>
-            <w:shd w:val="clear" w:color="auto" w:fill="F5F0E6"/>
           </w:tcPr>
           <w:p>
             <w:pPr>
@@ -260,7 +255,6 @@
         <w:tc>
           <w:tcPr>
             <w:tcW w:type="dxa" w:w="2948"/>
-            <w:shd w:val="clear" w:color="auto" w:fill="F5F0E6"/>
           </w:tcPr>
           <w:p>
             <w:pPr>
@@ -305,7 +299,6 @@
         <w:tc>
           <w:tcPr>
             <w:tcW w:type="dxa" w:w="2948"/>
-            <w:shd w:val="clear" w:color="auto" w:fill="F5F0E6"/>
           </w:tcPr>
           <w:p>
             <w:pPr>
@@ -350,7 +343,6 @@
         <w:tc>
           <w:tcPr>
             <w:tcW w:type="dxa" w:w="2948"/>
-            <w:shd w:val="clear" w:color="auto" w:fill="F5F0E6"/>
           </w:tcPr>
           <w:p>
             <w:pPr>
@@ -395,7 +387,6 @@
         <w:tc>
           <w:tcPr>
             <w:tcW w:type="dxa" w:w="2948"/>
-            <w:shd w:val="clear" w:color="auto" w:fill="F5F0E6"/>
           </w:tcPr>
           <w:p>
             <w:pPr>
@@ -440,7 +431,6 @@
         <w:tc>
           <w:tcPr>
             <w:tcW w:type="dxa" w:w="2948"/>
-            <w:shd w:val="clear" w:color="auto" w:fill="F5F0E6"/>
           </w:tcPr>
           <w:p>
             <w:pPr>
@@ -485,7 +475,6 @@
         <w:tc>
           <w:tcPr>
             <w:tcW w:type="dxa" w:w="2948"/>
-            <w:shd w:val="clear" w:color="auto" w:fill="F5F0E6"/>
           </w:tcPr>
           <w:p>
             <w:pPr>
@@ -530,7 +519,6 @@
         <w:tc>
           <w:tcPr>
             <w:tcW w:type="dxa" w:w="2948"/>
-            <w:shd w:val="clear" w:color="auto" w:fill="F5F0E6"/>
           </w:tcPr>
           <w:p>
             <w:pPr>
@@ -575,7 +563,6 @@
         <w:tc>
           <w:tcPr>
             <w:tcW w:type="dxa" w:w="2948"/>
-            <w:shd w:val="clear" w:color="auto" w:fill="F5F0E6"/>
           </w:tcPr>
           <w:p>
             <w:pPr>
@@ -640,11 +627,11 @@
         <w:jc w:val="left"/>
         <w:tblLook w:firstColumn="1" w:firstRow="1" w:lastColumn="0" w:lastRow="0" w:noHBand="0" w:noVBand="1" w:val="04A0"/>
         <w:tblBorders>
-          <w:top w:val="single" w:sz="4" w:color="A9BFA9"/>
-          <w:left w:val="nil"/>
-          <w:bottom w:val="single" w:sz="4" w:color="A9BFA9"/>
-          <w:right w:val="nil"/>
-          <w:insideH w:val="single" w:sz="4" w:color="A9BFA9"/>
+          <w:top w:val="single" w:sz="4" w:color="E7DFCF"/>
+          <w:left w:val="nil"/>
+          <w:bottom w:val="single" w:sz="4" w:color="E7DFCF"/>
+          <w:right w:val="nil"/>
+          <w:insideH w:val="single" w:sz="4" w:color="E7DFCF"/>
           <w:insideV w:val="nil"/>
         </w:tblBorders>
         <w:tblCellMar>
@@ -666,7 +653,9 @@
         <w:tc>
           <w:tcPr>
             <w:tcW w:type="dxa" w:w="3175"/>
-            <w:shd w:val="clear" w:color="auto" w:fill="E7DFCF"/>
+            <w:tcBorders>
+              <w:bottom w:val="single" w:sz="8" w:color="103428"/>
+            </w:tcBorders>
           </w:tcPr>
           <w:p>
             <w:pPr>
@@ -685,7 +674,9 @@
         <w:tc>
           <w:tcPr>
             <w:tcW w:type="dxa" w:w="2494"/>
-            <w:shd w:val="clear" w:color="auto" w:fill="E7DFCF"/>
+            <w:tcBorders>
+              <w:bottom w:val="single" w:sz="8" w:color="103428"/>
+            </w:tcBorders>
           </w:tcPr>
           <w:p>
             <w:pPr>
@@ -704,7 +695,9 @@
         <w:tc>
           <w:tcPr>
             <w:tcW w:type="dxa" w:w="3742"/>
-            <w:shd w:val="clear" w:color="auto" w:fill="E7DFCF"/>
+            <w:tcBorders>
+              <w:bottom w:val="single" w:sz="8" w:color="103428"/>
+            </w:tcBorders>
           </w:tcPr>
           <w:p>
             <w:pPr>
@@ -1170,7 +1163,7 @@
   <w:p>
     <w:pPr>
       <w:pBdr>
-        <w:top w:val="single" w:sz="4" w:space="6" w:color="A9BFA9"/>
+        <w:top w:val="single" w:sz="4" w:space="6" w:color="E7DFCF"/>
       </w:pBdr>
       <w:tabs>
         <w:tab w:pos="9412" w:val="right"/>
@@ -1192,7 +1185,7 @@
         <w:color w:val="5F6662"/>
         <w:sz w:val="15"/>
       </w:rPr>
-      <w:t xml:space="preserve">  ·  </w:t>
+      <w:t xml:space="preserve">   </w:t>
     </w:r>
     <w:r>
       <w:rPr>
@@ -1277,7 +1270,7 @@
         <w:caps/>
         <w:color w:val="5F6662"/>
         <w:sz w:val="15"/>
-        <w:spacing w:val="24"/>
+        <w:spacing w:val="10"/>
       </w:rPr>
       <w:tab/>
       <w:t>Investment opportunity profile</w:t>
@@ -1494,7 +1487,7 @@
   <w:docDefaults>
     <w:rPrDefault>
       <w:rPr>
-        <w:rFonts w:asciiTheme="minorHAnsi" w:eastAsiaTheme="minorEastAsia" w:hAnsiTheme="minorHAnsi" w:cstheme="minorBidi"/>
+        <w:rFonts w:ascii="Public Sans" w:hAnsi="Public Sans" w:cs="Public Sans" w:eastAsia="Public Sans"/>
         <w:sz w:val="22"/>
         <w:szCs w:val="22"/>
         <w:lang w:val="en-US" w:eastAsia="en-US" w:bidi="ar-SA"/>
@@ -1654,7 +1647,7 @@
       <w:spacing w:before="0" w:after="120" w:line="317" w:lineRule="auto"/>
     </w:pPr>
     <w:rPr>
-      <w:rFonts w:ascii="Inter" w:hAnsi="Inter" w:cs="Inter" w:eastAsia="Inter"/>
+      <w:rFonts w:ascii="Public Sans" w:hAnsi="Public Sans" w:cs="Public Sans" w:eastAsia="Public Sans"/>
       <w:b w:val="0"/>
       <w:i w:val="0"/>
       <w:color w:val="1B201E"/>
@@ -1716,16 +1709,16 @@
     <w:pPr>
       <w:keepNext/>
       <w:keepLines/>
-      <w:spacing w:before="360" w:after="120" w:line="264" w:lineRule="auto"/>
+      <w:spacing w:before="440" w:after="160" w:line="259" w:lineRule="auto"/>
       <w:outlineLvl w:val="0"/>
     </w:pPr>
     <w:rPr>
-      <w:rFonts w:asciiTheme="majorHAnsi" w:eastAsiaTheme="majorEastAsia" w:hAnsiTheme="majorHAnsi" w:cstheme="majorBidi" w:ascii="Playfair Display" w:hAnsi="Playfair Display" w:cs="Playfair Display" w:eastAsia="Playfair Display"/>
+      <w:rFonts w:ascii="Newsreader Display" w:hAnsi="Newsreader Display" w:cs="Newsreader Display" w:eastAsia="Newsreader Display"/>
       <w:b w:val="0"/>
       <w:bCs/>
       <w:i w:val="0"/>
       <w:color w:val="103428"/>
-      <w:sz w:val="40"/>
+      <w:sz w:val="44"/>
       <w:szCs w:val="28"/>
     </w:rPr>
   </w:style>
@@ -1745,12 +1738,12 @@
       <w:outlineLvl w:val="1"/>
     </w:pPr>
     <w:rPr>
-      <w:rFonts w:asciiTheme="majorHAnsi" w:eastAsiaTheme="majorEastAsia" w:hAnsiTheme="majorHAnsi" w:cstheme="majorBidi" w:ascii="Inter" w:hAnsi="Inter" w:cs="Inter" w:eastAsia="Inter"/>
-      <w:b/>
+      <w:rFonts w:ascii="Newsreader Display" w:hAnsi="Newsreader Display" w:cs="Newsreader Display" w:eastAsia="Newsreader Display"/>
+      <w:b w:val="0"/>
       <w:bCs/>
       <w:i w:val="0"/>
       <w:color w:val="103428"/>
-      <w:sz w:val="25"/>
+      <w:sz w:val="28"/>
       <w:szCs w:val="26"/>
     </w:rPr>
   </w:style>
@@ -1770,12 +1763,12 @@
       <w:outlineLvl w:val="2"/>
     </w:pPr>
     <w:rPr>
-      <w:rFonts w:asciiTheme="majorHAnsi" w:eastAsiaTheme="majorEastAsia" w:hAnsiTheme="majorHAnsi" w:cstheme="majorBidi" w:ascii="Inter" w:hAnsi="Inter" w:cs="Inter" w:eastAsia="Inter"/>
+      <w:rFonts w:ascii="Public Sans" w:hAnsi="Public Sans" w:cs="Public Sans" w:eastAsia="Public Sans"/>
       <w:b/>
       <w:bCs/>
       <w:i w:val="0"/>
-      <w:color w:val="2C5040"/>
-      <w:sz w:val="20"/>
+      <w:color w:val="103428"/>
+      <w:sz w:val="19"/>
     </w:rPr>
   </w:style>
   <w:style w:type="paragraph" w:styleId="Heading4">
@@ -1795,7 +1788,7 @@
       <w:outlineLvl w:val="3"/>
     </w:pPr>
     <w:rPr>
-      <w:rFonts w:asciiTheme="majorHAnsi" w:eastAsiaTheme="majorEastAsia" w:hAnsiTheme="majorHAnsi" w:cstheme="majorBidi"/>
+      <w:rFonts w:ascii="Newsreader Display" w:hAnsi="Newsreader Display" w:cs="Newsreader Display"/>
       <w:b/>
       <w:bCs/>
       <w:i/>
@@ -1820,7 +1813,7 @@
       <w:outlineLvl w:val="4"/>
     </w:pPr>
     <w:rPr>
-      <w:rFonts w:asciiTheme="majorHAnsi" w:eastAsiaTheme="majorEastAsia" w:hAnsiTheme="majorHAnsi" w:cstheme="majorBidi"/>
+      <w:rFonts w:ascii="Newsreader Display" w:hAnsi="Newsreader Display" w:cs="Newsreader Display"/>
       <w:color w:val="243F60" w:themeColor="accent1" w:themeShade="7F"/>
     </w:rPr>
   </w:style>
@@ -1841,7 +1834,7 @@
       <w:outlineLvl w:val="5"/>
     </w:pPr>
     <w:rPr>
-      <w:rFonts w:asciiTheme="majorHAnsi" w:eastAsiaTheme="majorEastAsia" w:hAnsiTheme="majorHAnsi" w:cstheme="majorBidi"/>
+      <w:rFonts w:ascii="Newsreader Display" w:hAnsi="Newsreader Display" w:cs="Newsreader Display"/>
       <w:i/>
       <w:iCs/>
       <w:color w:val="243F60" w:themeColor="accent1" w:themeShade="7F"/>
@@ -1864,7 +1857,7 @@
       <w:outlineLvl w:val="6"/>
     </w:pPr>
     <w:rPr>
-      <w:rFonts w:asciiTheme="majorHAnsi" w:eastAsiaTheme="majorEastAsia" w:hAnsiTheme="majorHAnsi" w:cstheme="majorBidi"/>
+      <w:rFonts w:ascii="Newsreader Display" w:hAnsi="Newsreader Display" w:cs="Newsreader Display"/>
       <w:i/>
       <w:iCs/>
       <w:color w:val="404040" w:themeColor="text1" w:themeTint="BF"/>
@@ -1887,7 +1880,7 @@
       <w:outlineLvl w:val="7"/>
     </w:pPr>
     <w:rPr>
-      <w:rFonts w:asciiTheme="majorHAnsi" w:eastAsiaTheme="majorEastAsia" w:hAnsiTheme="majorHAnsi" w:cstheme="majorBidi"/>
+      <w:rFonts w:ascii="Newsreader Display" w:hAnsi="Newsreader Display" w:cs="Newsreader Display"/>
       <w:color w:val="4F81BD" w:themeColor="accent1"/>
       <w:sz w:val="20"/>
       <w:szCs w:val="20"/>
@@ -1910,7 +1903,7 @@
       <w:outlineLvl w:val="8"/>
     </w:pPr>
     <w:rPr>
-      <w:rFonts w:asciiTheme="majorHAnsi" w:eastAsiaTheme="majorEastAsia" w:hAnsiTheme="majorHAnsi" w:cstheme="majorBidi"/>
+      <w:rFonts w:ascii="Newsreader Display" w:hAnsi="Newsreader Display" w:cs="Newsreader Display"/>
       <w:i/>
       <w:iCs/>
       <w:color w:val="404040" w:themeColor="text1" w:themeTint="BF"/>
@@ -1961,7 +1954,7 @@
     <w:uiPriority w:val="9"/>
     <w:rsid w:val="00FC693F"/>
     <w:rPr>
-      <w:rFonts w:asciiTheme="majorHAnsi" w:eastAsiaTheme="majorEastAsia" w:hAnsiTheme="majorHAnsi" w:cstheme="majorBidi"/>
+      <w:rFonts w:ascii="Newsreader Display" w:hAnsi="Newsreader Display" w:cs="Newsreader Display"/>
       <w:b/>
       <w:bCs/>
       <w:color w:val="365F91" w:themeColor="accent1" w:themeShade="BF"/>
@@ -1976,7 +1969,7 @@
     <w:uiPriority w:val="9"/>
     <w:rsid w:val="00FC693F"/>
     <w:rPr>
-      <w:rFonts w:asciiTheme="majorHAnsi" w:eastAsiaTheme="majorEastAsia" w:hAnsiTheme="majorHAnsi" w:cstheme="majorBidi"/>
+      <w:rFonts w:ascii="Newsreader Display" w:hAnsi="Newsreader Display" w:cs="Newsreader Display"/>
       <w:b/>
       <w:bCs/>
       <w:color w:val="4F81BD" w:themeColor="accent1"/>
@@ -1991,7 +1984,7 @@
     <w:uiPriority w:val="9"/>
     <w:rsid w:val="00FC693F"/>
     <w:rPr>
-      <w:rFonts w:asciiTheme="majorHAnsi" w:eastAsiaTheme="majorEastAsia" w:hAnsiTheme="majorHAnsi" w:cstheme="majorBidi"/>
+      <w:rFonts w:ascii="Newsreader Display" w:hAnsi="Newsreader Display" w:cs="Newsreader Display"/>
       <w:b/>
       <w:bCs/>
       <w:color w:val="4F81BD" w:themeColor="accent1"/>
@@ -2006,17 +1999,17 @@
     <w:qFormat/>
     <w:rsid w:val="00FC693F"/>
     <w:pPr>
-      <w:spacing w:after="160" w:line="252" w:lineRule="auto" w:before="0"/>
+      <w:spacing w:after="200" w:line="245" w:lineRule="auto" w:before="0"/>
       <w:contextualSpacing/>
     </w:pPr>
     <w:rPr>
-      <w:rFonts w:asciiTheme="majorHAnsi" w:eastAsiaTheme="majorEastAsia" w:hAnsiTheme="majorHAnsi" w:cstheme="majorBidi" w:ascii="Playfair Display" w:hAnsi="Playfair Display" w:cs="Playfair Display" w:eastAsia="Playfair Display"/>
+      <w:rFonts w:ascii="Newsreader Display" w:hAnsi="Newsreader Display" w:cs="Newsreader Display" w:eastAsia="Newsreader Display"/>
       <w:b w:val="0"/>
       <w:i w:val="0"/>
       <w:color w:val="103428"/>
       <w:spacing w:val="5"/>
       <w:kern w:val="28"/>
-      <w:sz w:val="60"/>
+      <w:sz w:val="64"/>
       <w:szCs w:val="52"/>
     </w:rPr>
   </w:style>
@@ -2027,7 +2020,7 @@
     <w:uiPriority w:val="10"/>
     <w:rsid w:val="00FC693F"/>
     <w:rPr>
-      <w:rFonts w:asciiTheme="majorHAnsi" w:eastAsiaTheme="majorEastAsia" w:hAnsiTheme="majorHAnsi" w:cstheme="majorBidi"/>
+      <w:rFonts w:ascii="Newsreader Display" w:hAnsi="Newsreader Display" w:cs="Newsreader Display"/>
       <w:color w:val="17365D" w:themeColor="text2" w:themeShade="BF"/>
       <w:spacing w:val="5"/>
       <w:kern w:val="28"/>
@@ -2050,13 +2043,13 @@
       <w:spacing w:before="0" w:after="240" w:line="312" w:lineRule="auto"/>
     </w:pPr>
     <w:rPr>
-      <w:rFonts w:asciiTheme="majorHAnsi" w:eastAsiaTheme="majorEastAsia" w:hAnsiTheme="majorHAnsi" w:cstheme="majorBidi" w:ascii="Source Serif 4" w:hAnsi="Source Serif 4" w:cs="Source Serif 4" w:eastAsia="Source Serif 4"/>
+      <w:rFonts w:ascii="Newsreader Text" w:hAnsi="Newsreader Text" w:cs="Newsreader Text" w:eastAsia="Newsreader Text"/>
       <w:b w:val="0"/>
       <w:i w:val="0"/>
       <w:iCs/>
-      <w:color w:val="2C5040"/>
+      <w:color w:val="5F6662"/>
       <w:spacing w:val="15"/>
-      <w:sz w:val="28"/>
+      <w:sz w:val="26"/>
       <w:szCs w:val="24"/>
     </w:rPr>
   </w:style>
@@ -2067,7 +2060,7 @@
     <w:uiPriority w:val="11"/>
     <w:rsid w:val="00FC693F"/>
     <w:rPr>
-      <w:rFonts w:asciiTheme="majorHAnsi" w:eastAsiaTheme="majorEastAsia" w:hAnsiTheme="majorHAnsi" w:cstheme="majorBidi"/>
+      <w:rFonts w:ascii="Newsreader Display" w:hAnsi="Newsreader Display" w:cs="Newsreader Display"/>
       <w:i/>
       <w:iCs/>
       <w:color w:val="4F81BD" w:themeColor="accent1"/>
@@ -2196,7 +2189,7 @@
       <w:contextualSpacing/>
     </w:pPr>
     <w:rPr>
-      <w:rFonts w:ascii="Inter" w:hAnsi="Inter" w:cs="Inter" w:eastAsia="Inter"/>
+      <w:rFonts w:ascii="Public Sans" w:hAnsi="Public Sans" w:cs="Public Sans" w:eastAsia="Public Sans"/>
       <w:b w:val="0"/>
       <w:i w:val="0"/>
       <w:color w:val="1B201E"/>
@@ -2243,7 +2236,7 @@
       <w:contextualSpacing/>
     </w:pPr>
     <w:rPr>
-      <w:rFonts w:ascii="Inter" w:hAnsi="Inter" w:cs="Inter" w:eastAsia="Inter"/>
+      <w:rFonts w:ascii="Public Sans" w:hAnsi="Public Sans" w:cs="Public Sans" w:eastAsia="Public Sans"/>
       <w:b w:val="0"/>
       <w:i w:val="0"/>
       <w:color w:val="1B201E"/>
@@ -2359,12 +2352,12 @@
       <w:spacing w:before="240" w:after="240" w:line="324" w:lineRule="auto"/>
     </w:pPr>
     <w:rPr>
-      <w:rFonts w:ascii="Source Serif 4" w:hAnsi="Source Serif 4" w:cs="Source Serif 4" w:eastAsia="Source Serif 4"/>
+      <w:rFonts w:ascii="Newsreader Display" w:hAnsi="Newsreader Display" w:cs="Newsreader Display" w:eastAsia="Newsreader Display"/>
       <w:b w:val="0"/>
       <w:i/>
       <w:iCs/>
       <w:color w:val="103428"/>
-      <w:sz w:val="28"/>
+      <w:sz w:val="32"/>
     </w:rPr>
   </w:style>
   <w:style w:type="character" w:customStyle="1" w:styleId="QuoteChar">
@@ -2387,7 +2380,7 @@
     <w:semiHidden/>
     <w:rsid w:val="00FC693F"/>
     <w:rPr>
-      <w:rFonts w:asciiTheme="majorHAnsi" w:eastAsiaTheme="majorEastAsia" w:hAnsiTheme="majorHAnsi" w:cstheme="majorBidi"/>
+      <w:rFonts w:ascii="Newsreader Display" w:hAnsi="Newsreader Display" w:cs="Newsreader Display"/>
       <w:b/>
       <w:bCs/>
       <w:i/>
@@ -2403,7 +2396,7 @@
     <w:semiHidden/>
     <w:rsid w:val="00FC693F"/>
     <w:rPr>
-      <w:rFonts w:asciiTheme="majorHAnsi" w:eastAsiaTheme="majorEastAsia" w:hAnsiTheme="majorHAnsi" w:cstheme="majorBidi"/>
+      <w:rFonts w:ascii="Newsreader Display" w:hAnsi="Newsreader Display" w:cs="Newsreader Display"/>
       <w:color w:val="243F60" w:themeColor="accent1" w:themeShade="7F"/>
     </w:rPr>
   </w:style>
@@ -2415,7 +2408,7 @@
     <w:semiHidden/>
     <w:rsid w:val="00FC693F"/>
     <w:rPr>
-      <w:rFonts w:asciiTheme="majorHAnsi" w:eastAsiaTheme="majorEastAsia" w:hAnsiTheme="majorHAnsi" w:cstheme="majorBidi"/>
+      <w:rFonts w:ascii="Newsreader Display" w:hAnsi="Newsreader Display" w:cs="Newsreader Display"/>
       <w:i/>
       <w:iCs/>
       <w:color w:val="243F60" w:themeColor="accent1" w:themeShade="7F"/>
@@ -2429,7 +2422,7 @@
     <w:semiHidden/>
     <w:rsid w:val="00FC693F"/>
     <w:rPr>
-      <w:rFonts w:asciiTheme="majorHAnsi" w:eastAsiaTheme="majorEastAsia" w:hAnsiTheme="majorHAnsi" w:cstheme="majorBidi"/>
+      <w:rFonts w:ascii="Newsreader Display" w:hAnsi="Newsreader Display" w:cs="Newsreader Display"/>
       <w:i/>
       <w:iCs/>
       <w:color w:val="404040" w:themeColor="text1" w:themeTint="BF"/>
@@ -2443,7 +2436,7 @@
     <w:semiHidden/>
     <w:rsid w:val="00FC693F"/>
     <w:rPr>
-      <w:rFonts w:asciiTheme="majorHAnsi" w:eastAsiaTheme="majorEastAsia" w:hAnsiTheme="majorHAnsi" w:cstheme="majorBidi"/>
+      <w:rFonts w:ascii="Newsreader Display" w:hAnsi="Newsreader Display" w:cs="Newsreader Display"/>
       <w:color w:val="4F81BD" w:themeColor="accent1"/>
       <w:sz w:val="20"/>
       <w:szCs w:val="20"/>
@@ -2457,7 +2450,7 @@
     <w:semiHidden/>
     <w:rsid w:val="00FC693F"/>
     <w:rPr>
-      <w:rFonts w:asciiTheme="majorHAnsi" w:eastAsiaTheme="majorEastAsia" w:hAnsiTheme="majorHAnsi" w:cstheme="majorBidi"/>
+      <w:rFonts w:ascii="Newsreader Display" w:hAnsi="Newsreader Display" w:cs="Newsreader Display"/>
       <w:i/>
       <w:iCs/>
       <w:color w:val="404040" w:themeColor="text1" w:themeTint="BF"/>
@@ -2478,7 +2471,7 @@
       <w:spacing w:line="300" w:lineRule="auto" w:before="60" w:after="200"/>
     </w:pPr>
     <w:rPr>
-      <w:rFonts w:ascii="Inter" w:hAnsi="Inter" w:cs="Inter" w:eastAsia="Inter"/>
+      <w:rFonts w:ascii="Public Sans" w:hAnsi="Public Sans" w:cs="Public Sans" w:eastAsia="Public Sans"/>
       <w:b w:val="0"/>
       <w:bCs/>
       <w:i w:val="0"/>
@@ -4048,7 +4041,7 @@
         <w:spacing w:before="0" w:after="0" w:line="240" w:lineRule="auto"/>
       </w:pPr>
       <w:rPr>
-        <w:rFonts w:asciiTheme="majorHAnsi" w:eastAsiaTheme="majorEastAsia" w:hAnsiTheme="majorHAnsi" w:cstheme="majorBidi"/>
+        <w:rFonts w:ascii="Newsreader Display" w:hAnsi="Newsreader Display" w:cs="Newsreader Display"/>
         <w:b/>
         <w:bCs/>
       </w:rPr>
@@ -4069,7 +4062,7 @@
         <w:spacing w:before="0" w:after="0" w:line="240" w:lineRule="auto"/>
       </w:pPr>
       <w:rPr>
-        <w:rFonts w:asciiTheme="majorHAnsi" w:eastAsiaTheme="majorEastAsia" w:hAnsiTheme="majorHAnsi" w:cstheme="majorBidi"/>
+        <w:rFonts w:ascii="Newsreader Display" w:hAnsi="Newsreader Display" w:cs="Newsreader Display"/>
         <w:b/>
         <w:bCs/>
       </w:rPr>
@@ -4087,14 +4080,14 @@
     </w:tblStylePr>
     <w:tblStylePr w:type="firstCol">
       <w:rPr>
-        <w:rFonts w:asciiTheme="majorHAnsi" w:eastAsiaTheme="majorEastAsia" w:hAnsiTheme="majorHAnsi" w:cstheme="majorBidi"/>
+        <w:rFonts w:ascii="Newsreader Display" w:hAnsi="Newsreader Display" w:cs="Newsreader Display"/>
         <w:b/>
         <w:bCs/>
       </w:rPr>
     </w:tblStylePr>
     <w:tblStylePr w:type="lastCol">
       <w:rPr>
-        <w:rFonts w:asciiTheme="majorHAnsi" w:eastAsiaTheme="majorEastAsia" w:hAnsiTheme="majorHAnsi" w:cstheme="majorBidi"/>
+        <w:rFonts w:ascii="Newsreader Display" w:hAnsi="Newsreader Display" w:cs="Newsreader Display"/>
         <w:b/>
         <w:bCs/>
       </w:rPr>
@@ -4178,7 +4171,7 @@
         <w:spacing w:before="0" w:after="0" w:line="240" w:lineRule="auto"/>
       </w:pPr>
       <w:rPr>
-        <w:rFonts w:asciiTheme="majorHAnsi" w:eastAsiaTheme="majorEastAsia" w:hAnsiTheme="majorHAnsi" w:cstheme="majorBidi"/>
+        <w:rFonts w:ascii="Newsreader Display" w:hAnsi="Newsreader Display" w:cs="Newsreader Display"/>
         <w:b/>
         <w:bCs/>
       </w:rPr>
@@ -4199,7 +4192,7 @@
         <w:spacing w:before="0" w:after="0" w:line="240" w:lineRule="auto"/>
       </w:pPr>
       <w:rPr>
-        <w:rFonts w:asciiTheme="majorHAnsi" w:eastAsiaTheme="majorEastAsia" w:hAnsiTheme="majorHAnsi" w:cstheme="majorBidi"/>
+        <w:rFonts w:ascii="Newsreader Display" w:hAnsi="Newsreader Display" w:cs="Newsreader Display"/>
         <w:b/>
         <w:bCs/>
       </w:rPr>
@@ -4217,14 +4210,14 @@
     </w:tblStylePr>
     <w:tblStylePr w:type="firstCol">
       <w:rPr>
-        <w:rFonts w:asciiTheme="majorHAnsi" w:eastAsiaTheme="majorEastAsia" w:hAnsiTheme="majorHAnsi" w:cstheme="majorBidi"/>
+        <w:rFonts w:ascii="Newsreader Display" w:hAnsi="Newsreader Display" w:cs="Newsreader Display"/>
         <w:b/>
         <w:bCs/>
       </w:rPr>
     </w:tblStylePr>
     <w:tblStylePr w:type="lastCol">
       <w:rPr>
-        <w:rFonts w:asciiTheme="majorHAnsi" w:eastAsiaTheme="majorEastAsia" w:hAnsiTheme="majorHAnsi" w:cstheme="majorBidi"/>
+        <w:rFonts w:ascii="Newsreader Display" w:hAnsi="Newsreader Display" w:cs="Newsreader Display"/>
         <w:b/>
         <w:bCs/>
       </w:rPr>
@@ -4308,7 +4301,7 @@
         <w:spacing w:before="0" w:after="0" w:line="240" w:lineRule="auto"/>
       </w:pPr>
       <w:rPr>
-        <w:rFonts w:asciiTheme="majorHAnsi" w:eastAsiaTheme="majorEastAsia" w:hAnsiTheme="majorHAnsi" w:cstheme="majorBidi"/>
+        <w:rFonts w:ascii="Newsreader Display" w:hAnsi="Newsreader Display" w:cs="Newsreader Display"/>
         <w:b/>
         <w:bCs/>
       </w:rPr>
@@ -4329,7 +4322,7 @@
         <w:spacing w:before="0" w:after="0" w:line="240" w:lineRule="auto"/>
       </w:pPr>
       <w:rPr>
-        <w:rFonts w:asciiTheme="majorHAnsi" w:eastAsiaTheme="majorEastAsia" w:hAnsiTheme="majorHAnsi" w:cstheme="majorBidi"/>
+        <w:rFonts w:ascii="Newsreader Display" w:hAnsi="Newsreader Display" w:cs="Newsreader Display"/>
         <w:b/>
         <w:bCs/>
       </w:rPr>
@@ -4347,14 +4340,14 @@
     </w:tblStylePr>
     <w:tblStylePr w:type="firstCol">
       <w:rPr>
-        <w:rFonts w:asciiTheme="majorHAnsi" w:eastAsiaTheme="majorEastAsia" w:hAnsiTheme="majorHAnsi" w:cstheme="majorBidi"/>
+        <w:rFonts w:ascii="Newsreader Display" w:hAnsi="Newsreader Display" w:cs="Newsreader Display"/>
         <w:b/>
         <w:bCs/>
       </w:rPr>
     </w:tblStylePr>
     <w:tblStylePr w:type="lastCol">
       <w:rPr>
-        <w:rFonts w:asciiTheme="majorHAnsi" w:eastAsiaTheme="majorEastAsia" w:hAnsiTheme="majorHAnsi" w:cstheme="majorBidi"/>
+        <w:rFonts w:ascii="Newsreader Display" w:hAnsi="Newsreader Display" w:cs="Newsreader Display"/>
         <w:b/>
         <w:bCs/>
       </w:rPr>
@@ -4438,7 +4431,7 @@
         <w:spacing w:before="0" w:after="0" w:line="240" w:lineRule="auto"/>
       </w:pPr>
       <w:rPr>
-        <w:rFonts w:asciiTheme="majorHAnsi" w:eastAsiaTheme="majorEastAsia" w:hAnsiTheme="majorHAnsi" w:cstheme="majorBidi"/>
+        <w:rFonts w:ascii="Newsreader Display" w:hAnsi="Newsreader Display" w:cs="Newsreader Display"/>
         <w:b/>
         <w:bCs/>
       </w:rPr>
@@ -4459,7 +4452,7 @@
         <w:spacing w:before="0" w:after="0" w:line="240" w:lineRule="auto"/>
       </w:pPr>
       <w:rPr>
-        <w:rFonts w:asciiTheme="majorHAnsi" w:eastAsiaTheme="majorEastAsia" w:hAnsiTheme="majorHAnsi" w:cstheme="majorBidi"/>
+        <w:rFonts w:ascii="Newsreader Display" w:hAnsi="Newsreader Display" w:cs="Newsreader Display"/>
         <w:b/>
         <w:bCs/>
       </w:rPr>
@@ -4477,14 +4470,14 @@
     </w:tblStylePr>
     <w:tblStylePr w:type="firstCol">
       <w:rPr>
-        <w:rFonts w:asciiTheme="majorHAnsi" w:eastAsiaTheme="majorEastAsia" w:hAnsiTheme="majorHAnsi" w:cstheme="majorBidi"/>
+        <w:rFonts w:ascii="Newsreader Display" w:hAnsi="Newsreader Display" w:cs="Newsreader Display"/>
         <w:b/>
         <w:bCs/>
       </w:rPr>
     </w:tblStylePr>
     <w:tblStylePr w:type="lastCol">
       <w:rPr>
-        <w:rFonts w:asciiTheme="majorHAnsi" w:eastAsiaTheme="majorEastAsia" w:hAnsiTheme="majorHAnsi" w:cstheme="majorBidi"/>
+        <w:rFonts w:ascii="Newsreader Display" w:hAnsi="Newsreader Display" w:cs="Newsreader Display"/>
         <w:b/>
         <w:bCs/>
       </w:rPr>
@@ -4568,7 +4561,7 @@
         <w:spacing w:before="0" w:after="0" w:line="240" w:lineRule="auto"/>
       </w:pPr>
       <w:rPr>
-        <w:rFonts w:asciiTheme="majorHAnsi" w:eastAsiaTheme="majorEastAsia" w:hAnsiTheme="majorHAnsi" w:cstheme="majorBidi"/>
+        <w:rFonts w:ascii="Newsreader Display" w:hAnsi="Newsreader Display" w:cs="Newsreader Display"/>
         <w:b/>
         <w:bCs/>
       </w:rPr>
@@ -4589,7 +4582,7 @@
         <w:spacing w:before="0" w:after="0" w:line="240" w:lineRule="auto"/>
       </w:pPr>
       <w:rPr>
-        <w:rFonts w:asciiTheme="majorHAnsi" w:eastAsiaTheme="majorEastAsia" w:hAnsiTheme="majorHAnsi" w:cstheme="majorBidi"/>
+        <w:rFonts w:ascii="Newsreader Display" w:hAnsi="Newsreader Display" w:cs="Newsreader Display"/>
         <w:b/>
         <w:bCs/>
       </w:rPr>
@@ -4607,14 +4600,14 @@
     </w:tblStylePr>
     <w:tblStylePr w:type="firstCol">
       <w:rPr>
-        <w:rFonts w:asciiTheme="majorHAnsi" w:eastAsiaTheme="majorEastAsia" w:hAnsiTheme="majorHAnsi" w:cstheme="majorBidi"/>
+        <w:rFonts w:ascii="Newsreader Display" w:hAnsi="Newsreader Display" w:cs="Newsreader Display"/>
         <w:b/>
         <w:bCs/>
       </w:rPr>
     </w:tblStylePr>
     <w:tblStylePr w:type="lastCol">
       <w:rPr>
-        <w:rFonts w:asciiTheme="majorHAnsi" w:eastAsiaTheme="majorEastAsia" w:hAnsiTheme="majorHAnsi" w:cstheme="majorBidi"/>
+        <w:rFonts w:ascii="Newsreader Display" w:hAnsi="Newsreader Display" w:cs="Newsreader Display"/>
         <w:b/>
         <w:bCs/>
       </w:rPr>
@@ -4698,7 +4691,7 @@
         <w:spacing w:before="0" w:after="0" w:line="240" w:lineRule="auto"/>
       </w:pPr>
       <w:rPr>
-        <w:rFonts w:asciiTheme="majorHAnsi" w:eastAsiaTheme="majorEastAsia" w:hAnsiTheme="majorHAnsi" w:cstheme="majorBidi"/>
+        <w:rFonts w:ascii="Newsreader Display" w:hAnsi="Newsreader Display" w:cs="Newsreader Display"/>
         <w:b/>
         <w:bCs/>
       </w:rPr>
@@ -4719,7 +4712,7 @@
         <w:spacing w:before="0" w:after="0" w:line="240" w:lineRule="auto"/>
       </w:pPr>
       <w:rPr>
-        <w:rFonts w:asciiTheme="majorHAnsi" w:eastAsiaTheme="majorEastAsia" w:hAnsiTheme="majorHAnsi" w:cstheme="majorBidi"/>
+        <w:rFonts w:ascii="Newsreader Display" w:hAnsi="Newsreader Display" w:cs="Newsreader Display"/>
         <w:b/>
         <w:bCs/>
       </w:rPr>
@@ -4737,14 +4730,14 @@
     </w:tblStylePr>
     <w:tblStylePr w:type="firstCol">
       <w:rPr>
-        <w:rFonts w:asciiTheme="majorHAnsi" w:eastAsiaTheme="majorEastAsia" w:hAnsiTheme="majorHAnsi" w:cstheme="majorBidi"/>
+        <w:rFonts w:ascii="Newsreader Display" w:hAnsi="Newsreader Display" w:cs="Newsreader Display"/>
         <w:b/>
         <w:bCs/>
       </w:rPr>
     </w:tblStylePr>
     <w:tblStylePr w:type="lastCol">
       <w:rPr>
-        <w:rFonts w:asciiTheme="majorHAnsi" w:eastAsiaTheme="majorEastAsia" w:hAnsiTheme="majorHAnsi" w:cstheme="majorBidi"/>
+        <w:rFonts w:ascii="Newsreader Display" w:hAnsi="Newsreader Display" w:cs="Newsreader Display"/>
         <w:b/>
         <w:bCs/>
       </w:rPr>
@@ -4828,7 +4821,7 @@
         <w:spacing w:before="0" w:after="0" w:line="240" w:lineRule="auto"/>
       </w:pPr>
       <w:rPr>
-        <w:rFonts w:asciiTheme="majorHAnsi" w:eastAsiaTheme="majorEastAsia" w:hAnsiTheme="majorHAnsi" w:cstheme="majorBidi"/>
+        <w:rFonts w:ascii="Newsreader Display" w:hAnsi="Newsreader Display" w:cs="Newsreader Display"/>
         <w:b/>
         <w:bCs/>
       </w:rPr>
@@ -4849,7 +4842,7 @@
         <w:spacing w:before="0" w:after="0" w:line="240" w:lineRule="auto"/>
       </w:pPr>
       <w:rPr>
-        <w:rFonts w:asciiTheme="majorHAnsi" w:eastAsiaTheme="majorEastAsia" w:hAnsiTheme="majorHAnsi" w:cstheme="majorBidi"/>
+        <w:rFonts w:ascii="Newsreader Display" w:hAnsi="Newsreader Display" w:cs="Newsreader Display"/>
         <w:b/>
         <w:bCs/>
       </w:rPr>
@@ -4867,14 +4860,14 @@
     </w:tblStylePr>
     <w:tblStylePr w:type="firstCol">
       <w:rPr>
-        <w:rFonts w:asciiTheme="majorHAnsi" w:eastAsiaTheme="majorEastAsia" w:hAnsiTheme="majorHAnsi" w:cstheme="majorBidi"/>
+        <w:rFonts w:ascii="Newsreader Display" w:hAnsi="Newsreader Display" w:cs="Newsreader Display"/>
         <w:b/>
         <w:bCs/>
       </w:rPr>
     </w:tblStylePr>
     <w:tblStylePr w:type="lastCol">
       <w:rPr>
-        <w:rFonts w:asciiTheme="majorHAnsi" w:eastAsiaTheme="majorEastAsia" w:hAnsiTheme="majorHAnsi" w:cstheme="majorBidi"/>
+        <w:rFonts w:ascii="Newsreader Display" w:hAnsi="Newsreader Display" w:cs="Newsreader Display"/>
         <w:b/>
         <w:bCs/>
       </w:rPr>
@@ -6739,7 +6732,7 @@
     </w:tblPr>
     <w:tblStylePr w:type="firstRow">
       <w:rPr>
-        <w:rFonts w:asciiTheme="majorHAnsi" w:eastAsiaTheme="majorEastAsia" w:hAnsiTheme="majorHAnsi" w:cstheme="majorBidi"/>
+        <w:rFonts w:ascii="Newsreader Display" w:hAnsi="Newsreader Display" w:cs="Newsreader Display"/>
       </w:rPr>
       <w:tblPr/>
       <w:tcPr>
@@ -6823,7 +6816,7 @@
     </w:tblPr>
     <w:tblStylePr w:type="firstRow">
       <w:rPr>
-        <w:rFonts w:asciiTheme="majorHAnsi" w:eastAsiaTheme="majorEastAsia" w:hAnsiTheme="majorHAnsi" w:cstheme="majorBidi"/>
+        <w:rFonts w:ascii="Newsreader Display" w:hAnsi="Newsreader Display" w:cs="Newsreader Display"/>
       </w:rPr>
       <w:tblPr/>
       <w:tcPr>
@@ -6907,7 +6900,7 @@
     </w:tblPr>
     <w:tblStylePr w:type="firstRow">
       <w:rPr>
-        <w:rFonts w:asciiTheme="majorHAnsi" w:eastAsiaTheme="majorEastAsia" w:hAnsiTheme="majorHAnsi" w:cstheme="majorBidi"/>
+        <w:rFonts w:ascii="Newsreader Display" w:hAnsi="Newsreader Display" w:cs="Newsreader Display"/>
       </w:rPr>
       <w:tblPr/>
       <w:tcPr>
@@ -6991,7 +6984,7 @@
     </w:tblPr>
     <w:tblStylePr w:type="firstRow">
       <w:rPr>
-        <w:rFonts w:asciiTheme="majorHAnsi" w:eastAsiaTheme="majorEastAsia" w:hAnsiTheme="majorHAnsi" w:cstheme="majorBidi"/>
+        <w:rFonts w:ascii="Newsreader Display" w:hAnsi="Newsreader Display" w:cs="Newsreader Display"/>
       </w:rPr>
       <w:tblPr/>
       <w:tcPr>
@@ -7075,7 +7068,7 @@
     </w:tblPr>
     <w:tblStylePr w:type="firstRow">
       <w:rPr>
-        <w:rFonts w:asciiTheme="majorHAnsi" w:eastAsiaTheme="majorEastAsia" w:hAnsiTheme="majorHAnsi" w:cstheme="majorBidi"/>
+        <w:rFonts w:ascii="Newsreader Display" w:hAnsi="Newsreader Display" w:cs="Newsreader Display"/>
       </w:rPr>
       <w:tblPr/>
       <w:tcPr>
@@ -7159,7 +7152,7 @@
     </w:tblPr>
     <w:tblStylePr w:type="firstRow">
       <w:rPr>
-        <w:rFonts w:asciiTheme="majorHAnsi" w:eastAsiaTheme="majorEastAsia" w:hAnsiTheme="majorHAnsi" w:cstheme="majorBidi"/>
+        <w:rFonts w:ascii="Newsreader Display" w:hAnsi="Newsreader Display" w:cs="Newsreader Display"/>
       </w:rPr>
       <w:tblPr/>
       <w:tcPr>
@@ -7243,7 +7236,7 @@
     </w:tblPr>
     <w:tblStylePr w:type="firstRow">
       <w:rPr>
-        <w:rFonts w:asciiTheme="majorHAnsi" w:eastAsiaTheme="majorEastAsia" w:hAnsiTheme="majorHAnsi" w:cstheme="majorBidi"/>
+        <w:rFonts w:ascii="Newsreader Display" w:hAnsi="Newsreader Display" w:cs="Newsreader Display"/>
       </w:rPr>
       <w:tblPr/>
       <w:tcPr>
@@ -7308,7 +7301,7 @@
       <w:spacing w:after="0" w:line="240" w:lineRule="auto"/>
     </w:pPr>
     <w:rPr>
-      <w:rFonts w:asciiTheme="majorHAnsi" w:eastAsiaTheme="majorEastAsia" w:hAnsiTheme="majorHAnsi" w:cstheme="majorBidi"/>
+      <w:rFonts w:ascii="Newsreader Display" w:hAnsi="Newsreader Display" w:cs="Newsreader Display"/>
       <w:color w:val="000000" w:themeColor="text1"/>
     </w:rPr>
     <w:tblPr>
@@ -7436,7 +7429,7 @@
       <w:spacing w:after="0" w:line="240" w:lineRule="auto"/>
     </w:pPr>
     <w:rPr>
-      <w:rFonts w:asciiTheme="majorHAnsi" w:eastAsiaTheme="majorEastAsia" w:hAnsiTheme="majorHAnsi" w:cstheme="majorBidi"/>
+      <w:rFonts w:ascii="Newsreader Display" w:hAnsi="Newsreader Display" w:cs="Newsreader Display"/>
       <w:color w:val="000000" w:themeColor="text1"/>
     </w:rPr>
     <w:tblPr>
@@ -7564,7 +7557,7 @@
       <w:spacing w:after="0" w:line="240" w:lineRule="auto"/>
     </w:pPr>
     <w:rPr>
-      <w:rFonts w:asciiTheme="majorHAnsi" w:eastAsiaTheme="majorEastAsia" w:hAnsiTheme="majorHAnsi" w:cstheme="majorBidi"/>
+      <w:rFonts w:ascii="Newsreader Display" w:hAnsi="Newsreader Display" w:cs="Newsreader Display"/>
       <w:color w:val="000000" w:themeColor="text1"/>
     </w:rPr>
     <w:tblPr>
@@ -7692,7 +7685,7 @@
       <w:spacing w:after="0" w:line="240" w:lineRule="auto"/>
     </w:pPr>
     <w:rPr>
-      <w:rFonts w:asciiTheme="majorHAnsi" w:eastAsiaTheme="majorEastAsia" w:hAnsiTheme="majorHAnsi" w:cstheme="majorBidi"/>
+      <w:rFonts w:ascii="Newsreader Display" w:hAnsi="Newsreader Display" w:cs="Newsreader Display"/>
       <w:color w:val="000000" w:themeColor="text1"/>
     </w:rPr>
     <w:tblPr>
@@ -7820,7 +7813,7 @@
       <w:spacing w:after="0" w:line="240" w:lineRule="auto"/>
     </w:pPr>
     <w:rPr>
-      <w:rFonts w:asciiTheme="majorHAnsi" w:eastAsiaTheme="majorEastAsia" w:hAnsiTheme="majorHAnsi" w:cstheme="majorBidi"/>
+      <w:rFonts w:ascii="Newsreader Display" w:hAnsi="Newsreader Display" w:cs="Newsreader Display"/>
       <w:color w:val="000000" w:themeColor="text1"/>
     </w:rPr>
     <w:tblPr>
@@ -7948,7 +7941,7 @@
       <w:spacing w:after="0" w:line="240" w:lineRule="auto"/>
     </w:pPr>
     <w:rPr>
-      <w:rFonts w:asciiTheme="majorHAnsi" w:eastAsiaTheme="majorEastAsia" w:hAnsiTheme="majorHAnsi" w:cstheme="majorBidi"/>
+      <w:rFonts w:ascii="Newsreader Display" w:hAnsi="Newsreader Display" w:cs="Newsreader Display"/>
       <w:color w:val="000000" w:themeColor="text1"/>
     </w:rPr>
     <w:tblPr>
@@ -8076,7 +8069,7 @@
       <w:spacing w:after="0" w:line="240" w:lineRule="auto"/>
     </w:pPr>
     <w:rPr>
-      <w:rFonts w:asciiTheme="majorHAnsi" w:eastAsiaTheme="majorEastAsia" w:hAnsiTheme="majorHAnsi" w:cstheme="majorBidi"/>
+      <w:rFonts w:ascii="Newsreader Display" w:hAnsi="Newsreader Display" w:cs="Newsreader Display"/>
       <w:color w:val="000000" w:themeColor="text1"/>
     </w:rPr>
     <w:tblPr>
@@ -8715,7 +8708,7 @@
       <w:spacing w:after="0" w:line="240" w:lineRule="auto"/>
     </w:pPr>
     <w:rPr>
-      <w:rFonts w:asciiTheme="majorHAnsi" w:eastAsiaTheme="majorEastAsia" w:hAnsiTheme="majorHAnsi" w:cstheme="majorBidi"/>
+      <w:rFonts w:ascii="Newsreader Display" w:hAnsi="Newsreader Display" w:cs="Newsreader Display"/>
       <w:color w:val="000000" w:themeColor="text1"/>
     </w:rPr>
     <w:tblPr>
@@ -8840,7 +8833,7 @@
       <w:spacing w:after="0" w:line="240" w:lineRule="auto"/>
     </w:pPr>
     <w:rPr>
-      <w:rFonts w:asciiTheme="majorHAnsi" w:eastAsiaTheme="majorEastAsia" w:hAnsiTheme="majorHAnsi" w:cstheme="majorBidi"/>
+      <w:rFonts w:ascii="Newsreader Display" w:hAnsi="Newsreader Display" w:cs="Newsreader Display"/>
       <w:color w:val="000000" w:themeColor="text1"/>
     </w:rPr>
     <w:tblPr>
@@ -8965,7 +8958,7 @@
       <w:spacing w:after="0" w:line="240" w:lineRule="auto"/>
     </w:pPr>
     <w:rPr>
-      <w:rFonts w:asciiTheme="majorHAnsi" w:eastAsiaTheme="majorEastAsia" w:hAnsiTheme="majorHAnsi" w:cstheme="majorBidi"/>
+      <w:rFonts w:ascii="Newsreader Display" w:hAnsi="Newsreader Display" w:cs="Newsreader Display"/>
       <w:color w:val="000000" w:themeColor="text1"/>
     </w:rPr>
     <w:tblPr>
@@ -9090,7 +9083,7 @@
       <w:spacing w:after="0" w:line="240" w:lineRule="auto"/>
     </w:pPr>
     <w:rPr>
-      <w:rFonts w:asciiTheme="majorHAnsi" w:eastAsiaTheme="majorEastAsia" w:hAnsiTheme="majorHAnsi" w:cstheme="majorBidi"/>
+      <w:rFonts w:ascii="Newsreader Display" w:hAnsi="Newsreader Display" w:cs="Newsreader Display"/>
       <w:color w:val="000000" w:themeColor="text1"/>
     </w:rPr>
     <w:tblPr>
@@ -9215,7 +9208,7 @@
       <w:spacing w:after="0" w:line="240" w:lineRule="auto"/>
     </w:pPr>
     <w:rPr>
-      <w:rFonts w:asciiTheme="majorHAnsi" w:eastAsiaTheme="majorEastAsia" w:hAnsiTheme="majorHAnsi" w:cstheme="majorBidi"/>
+      <w:rFonts w:ascii="Newsreader Display" w:hAnsi="Newsreader Display" w:cs="Newsreader Display"/>
       <w:color w:val="000000" w:themeColor="text1"/>
     </w:rPr>
     <w:tblPr>
@@ -9340,7 +9333,7 @@
       <w:spacing w:after="0" w:line="240" w:lineRule="auto"/>
     </w:pPr>
     <w:rPr>
-      <w:rFonts w:asciiTheme="majorHAnsi" w:eastAsiaTheme="majorEastAsia" w:hAnsiTheme="majorHAnsi" w:cstheme="majorBidi"/>
+      <w:rFonts w:ascii="Newsreader Display" w:hAnsi="Newsreader Display" w:cs="Newsreader Display"/>
       <w:color w:val="000000" w:themeColor="text1"/>
     </w:rPr>
     <w:tblPr>
@@ -9465,7 +9458,7 @@
       <w:spacing w:after="0" w:line="240" w:lineRule="auto"/>
     </w:pPr>
     <w:rPr>
-      <w:rFonts w:asciiTheme="majorHAnsi" w:eastAsiaTheme="majorEastAsia" w:hAnsiTheme="majorHAnsi" w:cstheme="majorBidi"/>
+      <w:rFonts w:ascii="Newsreader Display" w:hAnsi="Newsreader Display" w:cs="Newsreader Display"/>
       <w:color w:val="000000" w:themeColor="text1"/>
     </w:rPr>
     <w:tblPr>
@@ -13380,27 +13373,27 @@
       <w:spacing w:before="0" w:after="80" w:line="288" w:lineRule="auto"/>
     </w:pPr>
     <w:rPr>
-      <w:rFonts w:ascii="Inter" w:hAnsi="Inter" w:cs="Inter" w:eastAsia="Inter"/>
+      <w:rFonts w:ascii="Public Sans" w:hAnsi="Public Sans" w:cs="Public Sans" w:eastAsia="Public Sans"/>
       <w:b/>
       <w:i w:val="0"/>
       <w:caps/>
-      <w:color w:val="9A6510"/>
-      <w:sz w:val="16"/>
-      <w:spacing w:val="32"/>
+      <w:color w:val="8A5A0C"/>
+      <w:sz w:val="15"/>
+      <w:spacing w:val="12"/>
     </w:rPr>
   </w:style>
   <w:style w:type="paragraph" w:customStyle="1" w:styleId="Lead">
     <w:name w:val="Lead"/>
     <w:basedOn w:val="Normal"/>
     <w:pPr>
-      <w:spacing w:before="0" w:after="200" w:line="336" w:lineRule="auto"/>
+      <w:spacing w:before="0" w:after="240" w:line="331" w:lineRule="auto"/>
     </w:pPr>
     <w:rPr>
-      <w:rFonts w:ascii="Source Serif 4" w:hAnsi="Source Serif 4" w:cs="Source Serif 4" w:eastAsia="Source Serif 4"/>
+      <w:rFonts w:ascii="Newsreader Text" w:hAnsi="Newsreader Text" w:cs="Newsreader Text" w:eastAsia="Newsreader Text"/>
       <w:b w:val="0"/>
       <w:i w:val="0"/>
       <w:color w:val="103428"/>
-      <w:sz w:val="25"/>
+      <w:sz w:val="26"/>
     </w:rPr>
   </w:style>
   <w:style w:type="paragraph" w:customStyle="1" w:styleId="Small">
@@ -13410,7 +13403,7 @@
       <w:spacing w:before="0" w:after="40" w:line="300" w:lineRule="auto"/>
     </w:pPr>
     <w:rPr>
-      <w:rFonts w:ascii="Inter" w:hAnsi="Inter" w:cs="Inter" w:eastAsia="Inter"/>
+      <w:rFonts w:ascii="Public Sans" w:hAnsi="Public Sans" w:cs="Public Sans" w:eastAsia="Public Sans"/>
       <w:b w:val="0"/>
       <w:i w:val="0"/>
       <w:color w:val="5F6662"/>
@@ -13424,7 +13417,7 @@
       <w:spacing w:before="20" w:after="20" w:line="276" w:lineRule="auto"/>
     </w:pPr>
     <w:rPr>
-      <w:rFonts w:ascii="Inter" w:hAnsi="Inter" w:cs="Inter" w:eastAsia="Inter"/>
+      <w:rFonts w:ascii="Public Sans" w:hAnsi="Public Sans" w:cs="Public Sans" w:eastAsia="Public Sans"/>
       <w:b w:val="0"/>
       <w:i w:val="0"/>
       <w:color w:val="1B201E"/>
@@ -13438,13 +13431,13 @@
       <w:spacing w:before="40" w:after="40" w:line="264" w:lineRule="auto"/>
     </w:pPr>
     <w:rPr>
-      <w:rFonts w:ascii="Inter" w:hAnsi="Inter" w:cs="Inter" w:eastAsia="Inter"/>
+      <w:rFonts w:ascii="Public Sans" w:hAnsi="Public Sans" w:cs="Public Sans" w:eastAsia="Public Sans"/>
       <w:b/>
       <w:i w:val="0"/>
       <w:caps/>
       <w:color w:val="103428"/>
-      <w:sz w:val="16"/>
-      <w:spacing w:val="12"/>
+      <w:sz w:val="15"/>
+      <w:spacing w:val="10"/>
     </w:rPr>
   </w:style>
 </w:styles>

</xml_diff>